<commit_message>
Refresh submission report and ETL evidence
</commit_message>
<xml_diff>
--- a/output/documents/BDA501_Final_Project_Report_Submission.docx
+++ b/output/documents/BDA501_Final_Project_Report_Submission.docx
@@ -97,7 +97,7 @@
           <w:rFonts w:ascii="Times New Roman" w:hAnsi="Times New Roman"/>
           <w:sz w:val="24"/>
         </w:rPr>
-        <w:t>Nhóm / thành viên: ______________________________________________</w:t>
+        <w:t>Lớp / nhóm / thành viên: ______________________________________________</w:t>
       </w:r>
     </w:p>
     <w:p>
@@ -110,6 +110,12 @@
           <w:sz w:val="24"/>
         </w:rPr>
         <w:t>Ngày lập: 04/10/2026</w:t>
+      </w:r>
+    </w:p>
+    <w:p>
+      <w:pPr/>
+      <w:r>
+        <w:t>Repository / submission path: https://github.com/vi-ht/Fleet-management</w:t>
       </w:r>
     </w:p>
     <w:p>
@@ -1266,7 +1272,7 @@
           <w:rFonts w:ascii="Times New Roman" w:hAnsi="Times New Roman"/>
           <w:sz w:val="24"/>
         </w:rPr>
-        <w:t>Snapshot raw profile ngày 03/10/2026 ghi nhận 7 TLC Parquet files và 26.116.976 dòng. ETL enrichment chạy ngày 04/10/2026 xác nhận 26.116.976 dòng trước/sau join, 0 unmatched pickup/dropoff; curated schema có 13 trường (7 trường chuyến/feature thời gian và 6 trường tên zone/borough/service zone). Source checksums lưu tại evidence/hdfs_raw_checksums.txt; profile và join validation lưu trong evidence/data_profile.json và service_spark_etl.log.</w:t>
+        <w:t>Snapshot raw profile ngày 03/10/2026 ghi nhận 7 TLC Parquet files và 26.116.976 dòng. ETL enrichment chạy ngày 04/10/2026 xác nhận 26.116.976 dòng trước/sau join, 0 unmatched pickup/dropoff; curated schema có 13 trường (7 trường chuyến/feature thời gian và 6 trường tên zone/borough/service zone). Source checksums lưu tại output/evidence/hdfs_raw_checksums.txt; profile và join validation lưu trong output/evidence/data_profile.json và output/evidence/spark_etl_enrichment.log.</w:t>
       </w:r>
     </w:p>
     <w:tbl>
@@ -1453,7 +1459,7 @@
                 <w:b w:val="0"/>
                 <w:sz w:val="24"/>
               </w:rPr>
-              <w:t>Raw-profile checks in evidence/data_profile.json</w:t>
+              <w:t>Raw-profile checks in output/evidence/data_profile.json</w:t>
             </w:r>
           </w:p>
         </w:tc>
@@ -1975,7 +1981,7 @@
           <w:rFonts w:ascii="Times New Roman" w:hAnsi="Times New Roman"/>
           <w:sz w:val="24"/>
         </w:rPr>
-        <w:t>Môi trường: Spark 3.5.3 (apache/spark:3.5.3-scala2.12-java17-python3-ubuntu); Hadoop 3.2.1; Kafka 3.7.1; MongoDB 7.0. Python packages được pin trong requirements.txt: Flask 3.0.3, kafka-python 2.0.2, numpy 1.26.4, pandas 2.2.3, pymongo 4.8.0, pyarrow 17.0.0, requests 2.32.3. Service tags và cấu hình xem docker-compose.yml.</w:t>
+        <w:t>Môi trường: Spark 3.5.3 (apache/spark:3.5.3-scala2.12-java17-python3-ubuntu); Hadoop 3.2.1; Kafka 3.7.1; MongoDB 7.0. Python packages được pin trong requirements.txt: Flask 3.1.3, kafka-python 2.3.2, NumPy 1.26.4, pandas 2.2.3, PyMongo 4.8.0, PyArrow 23.0.1, requests 2.33.0. Dependency audit ngày 04/10/2026 không ghi nhận lỗ hổng đã biết trong các package được cài. Service tags và cấu hình xem docker-compose.yml; audit lưu tại output/evidence/dependency_audit.json.</w:t>
       </w:r>
     </w:p>
     <w:tbl>
@@ -2402,7 +2408,7 @@
           <w:rFonts w:ascii="Times New Roman" w:hAnsi="Times New Roman"/>
           <w:sz w:val="24"/>
         </w:rPr>
-        <w:t>Lần chạy 04/10/2026 ghi nhận 26.116.976 map input/output records; combiner nhận 26.167.760 và phát 62.883 records; reducer ghi 6.155 nhóm. Kết quả khớp Counter baseline độc lập. Log/CSV: data/results/hadoop_streaming.log, mapreduce_actual.csv và mapreduce_expected.csv. Hadoop dùng LocalJobRunner trên một máy, không phải YARN đa node.</w:t>
+        <w:t>Lần chạy 04/10/2026 ghi nhận 26.116.976 map input/output records; combiner nhận 26.167.760 và phát 62.883 records; reducer ghi 6.155 nhóm. Kết quả khớp Counter baseline độc lập. Log/CSV: output/evidence/hadoop_streaming.log, mapreduce_actual.csv và mapreduce_expected.csv. Hadoop dùng LocalJobRunner trên một máy, không phải YARN đa node.</w:t>
       </w:r>
     </w:p>
     <w:p>
@@ -2842,7 +2848,7 @@
           <w:rFonts w:ascii="Times New Roman" w:hAnsi="Times New Roman"/>
           <w:sz w:val="24"/>
         </w:rPr>
-        <w:t>spark/queries.py chạy truy vấn top 20 zone-hour-weekday và truy vấn borough-hour với 192 kết quả. Output: data/results/spark_query_results.json. Formatted explain plans trong data/results/spark_query_plans.txt thể hiện Aggregate và Exchange; Exchange là ranh giới shuffle cần phân phối các key tổng hợp giữa partitions. Broadcast lookup dimension nhỏ hạn chế shuffle join.</w:t>
+        <w:t>spark/queries.py chạy truy vấn top 20 zone-hour-weekday và truy vấn borough-hour với 192 kết quả. Output: output/evidence/spark_query_results.json. Formatted explain plans trong output/evidence/spark_query_plans.txt thể hiện Aggregate và Exchange; Exchange là ranh giới shuffle cần phân phối các key tổng hợp giữa partitions. Broadcast lookup dimension nhỏ hạn chế shuffle join.</w:t>
       </w:r>
     </w:p>
     <w:p>
@@ -2890,7 +2896,7 @@
           <w:rFonts w:ascii="Times New Roman" w:hAnsi="Times New Roman"/>
           <w:sz w:val="24"/>
         </w:rPr>
-        <w:t>Spark 3.5.3 đo cùng sample cache 100.000 dòng, loại warm-up, ba lượt mỗi cấu hình, chỉ thay shuffle partitions 4/16. Cả hai sinh 13.725 nhóm giống nhau; median 0,272/0,238 giây. Timing local nhạy với cache/JVM/host, không suy rộng thành hiệu năng cluster. Artifact: data/results/performance_benchmark.json.</w:t>
+        <w:t>Spark 3.5.3 đo cùng sample cache 100.000 dòng, loại warm-up, ba lượt mỗi cấu hình, chỉ thay shuffle partitions 4/16. Cả hai sinh 13.725 nhóm giống nhau; median 0,272/0,238 giây. Timing local nhạy với cache/JVM/host, không suy rộng thành hiệu năng cluster. Artifact: output/evidence/performance_benchmark.json.</w:t>
       </w:r>
     </w:p>
     <w:p>
@@ -3203,7 +3209,7 @@
           <w:rFonts w:ascii="Times New Roman" w:hAnsi="Times New Roman"/>
           <w:sz w:val="24"/>
         </w:rPr>
-        <w:t>spark/train_model.py tổng hợp theo service_date, pickup_zone, pickup_hour và pickup_dow. GBTRegressor nhận pickup_hour, pickup_dow và biểu diễn one-hot của pickup_zone. Model và metric được lưu vào model volume và data/results/model_metrics.json. Streaming nạp tệp kết quả đó và giới hạn điểm dự đoán trong khoảng 0–100.</w:t>
+        <w:t>spark/train_model.py tổng hợp theo service_date, pickup_zone, pickup_hour và pickup_dow. GBTRegressor nhận pickup_hour, pickup_dow và biểu diễn one-hot của pickup_zone. Model và metric được lưu vào model volume và output/evidence/model_metrics.json. Streaming nạp tệp kết quả đó và giới hạn điểm dự đoán trong khoảng 0–100.</w:t>
       </w:r>
     </w:p>
     <w:p>
@@ -3945,7 +3951,7 @@
           <w:rFonts w:ascii="Times New Roman" w:hAnsi="Times New Roman"/>
           <w:sz w:val="24"/>
         </w:rPr>
-        <w:t>MongoDB lưu hotspot_predictions cho kết quả model theo event_id, zone và event_time; API truy vấn các bản ghi gần nhất theo zone/thời gian để dựng ranking, lịch sử và forecast. vehicle_status giữ trạng thái mới nhất theo vehicle_id để dashboard đọc đội xe. mongodb/init.js tạo index event_time, zone+event_time, event_id và unique vehicle_id. Snapshot runtime ghi dashboard/API 359.685 prediction records trên 121 zone (count biến đổi khi replay tiếp tục). Read-back evidence: evidence/mongo_hotspot_count.json và evidence/dashboard_snapshot.json.</w:t>
+        <w:t>MongoDB lưu hotspot_predictions cho kết quả model theo event_id, zone và event_time; API truy vấn các bản ghi gần nhất theo zone/thời gian để dựng ranking, lịch sử và forecast. vehicle_status giữ trạng thái mới nhất theo vehicle_id để dashboard đọc đội xe. mongodb/init.js tạo index event_time, pickup_zone+event_time, event_id và unique vehicle_id. Snapshot ngày 04/10/2026 lúc 03:10 +07 ghi dashboard API trả 387.421 bản ghi trên 121 zone; truy vấn đếm collection taxi.hotspot_predictions cùng thời điểm ghi 387.499 bản ghi. Hai số được lưu riêng trong output/output/evidence/dashboard_snapshot.json và mongo_hotspot_count.json; replay tiếp tục nên số lượng thay đổi theo thời điểm chụp. Read-back evidence: output/output/evidence/dashboard_snapshot.json và output/output/evidence/runtime_metrics.json. Truy vấn đọc lại tiêu biểu: db.hotspot_predictions.find({pickup_zone: "132"}, {_id: 0}).sort({event_time: -1}).limit(30); dashboard gọi GET /api/predictions?zone=132&amp;limit=30.</w:t>
       </w:r>
     </w:p>
     <w:p>
@@ -4576,7 +4582,7 @@
           <w:rFonts w:ascii="Times New Roman" w:hAnsi="Times New Roman"/>
           <w:sz w:val="24"/>
         </w:rPr>
-        <w:t>Dashboard và bản đồ được chụp ngày 04/10/2026 sau lần train temporal. Ảnh dashboard hiển thị metric mới, thời tiết, zone polygons và 40 xe mô phỏng. API snapshot riêng lúc 01:36 (+07) ghi 359.685 prediction records trên 121 zone. Ảnh dashboard được chụp sớm hơn khi bộ đếm còn 356.281; các số thay đổi khi replay tiếp tục.</w:t>
+        <w:t>Dashboard và bản đồ được chụp ngày 04/10/2026 sau lần train temporal. Ảnh dashboard lưu trong output/playwright/weather-model-dashboard-2026-10-04.png hiển thị 356.281 bản ghi tại lúc chụp; snapshot dashboard API lúc 03:10 +07 trả 387.421 bản ghi trên 121 zone, còn MongoDB count lúc đó là 387.499. Đây là các snapshot ở thời điểm khác nhau trong khi replay vẫn chạy; số liệu trên ảnh không được xem là count hiện tại. Chi tiết snapshot và timestamp nằm trong output/output/evidence/runtime_metrics.json, dashboard_snapshot.json và mongo_hotspot_count.json.</w:t>
       </w:r>
     </w:p>
     <w:p>
@@ -4695,7 +4701,7 @@
           <w:rFonts w:ascii="Times New Roman" w:hAnsi="Times New Roman"/>
           <w:sz w:val="24"/>
         </w:rPr>
-        <w:t>13.4 Bằng chứng runtime và kết quả xử lý</w:t>
+        <w:t>13.2 Bằng chứng runtime và kết quả xử lý</w:t>
       </w:r>
     </w:p>
     <w:p>
@@ -4704,7 +4710,7 @@
         <w:jc w:val="center"/>
       </w:pPr>
       <w:r>
-        <w:t>Hình 4 tổng hợp các trích đoạn từ Hadoop Streaming log, model metrics JSON, live API snapshot và Spark partition benchmark ngày 04/10/2026. Hadoop output được so với Counter baseline độc lập; các kết quả hiệu năng chỉ áp dụng cho sample/configuration đã ghi.</w:t>
+        <w:t>Hình 4 tổng hợp các trích đoạn từ Hadoop Streaming log, model metrics JSON, dashboard API snapshot và Spark partition benchmark ngày 04/10/2026. Hadoop output được so với Counter baseline độc lập; các kết quả hiệu năng chỉ áp dụng cho sample/configuration đã ghi.</w:t>
       </w:r>
     </w:p>
     <w:p>
@@ -4760,7 +4766,7 @@
         <w:jc w:val="center"/>
       </w:pPr>
       <w:r>
-        <w:t>Hình 4. Trích log runtime và trạng thái các bước xử lý batch.</w:t>
+        <w:t>Hình 4. Trích log runtime, metrics temporal và kết quả xử lý batch.</w:t>
       </w:r>
     </w:p>
     <w:p>
@@ -4772,7 +4778,7 @@
           <w:rFonts w:ascii="Times New Roman" w:hAnsi="Times New Roman"/>
           <w:sz w:val="24"/>
         </w:rPr>
-        <w:t>13.2 Dashboard, bản đồ và replay</w:t>
+        <w:t>13.3 Dashboard, bản đồ và replay</w:t>
       </w:r>
     </w:p>
     <w:p>
@@ -4784,7 +4790,7 @@
           <w:rFonts w:ascii="Times New Roman" w:hAnsi="Times New Roman"/>
           <w:sz w:val="24"/>
         </w:rPr>
-        <w:t>Dashboard cung cấp bộ lọc zone và khung giờ, bản đồ polygon Taxi Zone tô theo score, danh sách hotspot, forecast ba giờ và đội xe mô phỏng. Trang co giãn ở viewport 390 px; ảnh và kiểm tra giao diện lưu tại output/playwright/weather-model-dashboard-2026-10-04.png, weather-model-map-2026-10-04.png và weather-model-mobile-2026-10-04.png. Màu đỏ biểu thị score tương đối cao, không khẳng định nguyên nhân hoặc số chuyến thực tế.</w:t>
+        <w:t>Dashboard cung cấp bộ lọc zone và khung giờ, bản đồ polygon Taxi Zone tô theo score, danh sách hotspot, forecast ba giờ và đội xe mô phỏng. Kiểm tra live tại viewport 375, 768 và 1440 px không phát hiện tràn ngang; điều hướng và bộ lọc zone hoạt động. Ảnh và kết quả lưu tại output/playwright/browser-qa-375.png, browser-qa-768.png, browser-qa-1440.png và output/evidence/browser_qa_summary_2026-10-04.json. Ảnh dashboard/map/mobile ở weather-model-dashboard-2026-10-04.png, weather-model-map-2026-10-04.png và weather-model-mobile-2026-10-04.png. Kiểm tra accessibility là rà snapshot thủ công; axe scan và visual regression baseline chưa chạy. Màu đỏ biểu thị score tương đối cao, không khẳng định nguyên nhân hoặc số chuyến thực tế.</w:t>
       </w:r>
     </w:p>
     <w:p>
@@ -4796,7 +4802,7 @@
           <w:rFonts w:ascii="Times New Roman" w:hAnsi="Times New Roman"/>
           <w:sz w:val="24"/>
         </w:rPr>
-        <w:t>13.3 Thời tiết và cảnh báo bất thường</w:t>
+        <w:t>13.4 Thời tiết và cảnh báo bất thường</w:t>
       </w:r>
     </w:p>
     <w:p>
@@ -4897,6 +4903,8 @@
     </w:p>
     <w:p>
       <w:pPr>
+        <w:keepNext/>
+        <w:pageBreakBefore/>
         <w:spacing w:line="300" w:lineRule="auto" w:after="160"/>
       </w:pPr>
       <w:r>
@@ -4920,6 +4928,9 @@
         <w:gridCol w:w="3154"/>
       </w:tblGrid>
       <w:tr>
+        <w:trPr>
+          <w:cantSplit/>
+        </w:trPr>
         <w:tc>
           <w:tcPr>
             <w:tcW w:type="dxa" w:w="3154"/>
@@ -4976,6 +4987,9 @@
         </w:tc>
       </w:tr>
       <w:tr>
+        <w:trPr>
+          <w:cantSplit/>
+        </w:trPr>
         <w:tc>
           <w:tcPr>
             <w:tcW w:type="dxa" w:w="3154"/>
@@ -5023,12 +5037,15 @@
                 <w:rFonts w:ascii="Times New Roman" w:hAnsi="Times New Roman"/>
                 <w:sz w:val="24"/>
               </w:rPr>
-              <w:t>Nguồn TLC, schema/profile 26.116.976 dòng, kiểm tra row-count/join; evidence/data_profile.json.</w:t>
+              <w:t>Nguồn TLC, schema/profile 26.116.976 dòng, kiểm tra row-count/join; output/evidence/data_profile.json.</w:t>
             </w:r>
           </w:p>
         </w:tc>
       </w:tr>
       <w:tr>
+        <w:trPr>
+          <w:cantSplit/>
+        </w:trPr>
         <w:tc>
           <w:tcPr>
             <w:tcW w:type="dxa" w:w="3154"/>
@@ -5076,12 +5093,15 @@
                 <w:rFonts w:ascii="Times New Roman" w:hAnsi="Times New Roman"/>
                 <w:sz w:val="24"/>
               </w:rPr>
-              <w:t>Hadoop Streaming key-value, shuffle, combiner/reducer và so sánh Counter baseline; data/results/hadoop_streaming.log.</w:t>
+              <w:t>Hadoop Streaming key-value, shuffle, combiner/reducer và so sánh Counter baseline; output/evidence/hadoop_streaming.log.</w:t>
             </w:r>
           </w:p>
         </w:tc>
       </w:tr>
       <w:tr>
+        <w:trPr>
+          <w:cantSplit/>
+        </w:trPr>
         <w:tc>
           <w:tcPr>
             <w:tcW w:type="dxa" w:w="3154"/>
@@ -5129,12 +5149,15 @@
                 <w:rFonts w:ascii="Times New Roman" w:hAnsi="Times New Roman"/>
                 <w:sz w:val="24"/>
               </w:rPr>
-              <w:t>PySpark ETL, Spark SQL, formatted plan có Exchange, partition experiment; data/results/spark_query_plans.txt và performance_benchmark.json.</w:t>
+              <w:t>PySpark ETL, Spark SQL, formatted plan có Exchange, partition experiment; output/evidence/spark_query_plans.txt và performance_benchmark.json.</w:t>
             </w:r>
           </w:p>
         </w:tc>
       </w:tr>
       <w:tr>
+        <w:trPr>
+          <w:cantSplit/>
+        </w:trPr>
         <w:tc>
           <w:tcPr>
             <w:tcW w:type="dxa" w:w="3154"/>
@@ -5182,12 +5205,15 @@
                 <w:rFonts w:ascii="Times New Roman" w:hAnsi="Times New Roman"/>
                 <w:sz w:val="24"/>
               </w:rPr>
-              <w:t>GBTRegressor temporal holdout; MAE/RMSE/R² và Precision/Recall; data/results/model_metrics.json.</w:t>
+              <w:t>GBTRegressor temporal holdout; MAE/RMSE/R² và Precision/Recall; output/evidence/model_metrics.json.</w:t>
             </w:r>
           </w:p>
         </w:tc>
       </w:tr>
       <w:tr>
+        <w:trPr>
+          <w:cantSplit/>
+        </w:trPr>
         <w:tc>
           <w:tcPr>
             <w:tcW w:type="dxa" w:w="3154"/>
@@ -5235,7 +5261,7 @@
                 <w:rFonts w:ascii="Times New Roman" w:hAnsi="Times New Roman"/>
                 <w:sz w:val="24"/>
               </w:rPr>
-              <w:t>Kafka replay/Structured Streaming, MongoDB read-back, dashboard/map; evidence/runtime_capture_2026-10-04.json.</w:t>
+              <w:t>Kafka replay/Structured Streaming, MongoDB read-back, dashboard/map; output/evidence/runtime_capture_2026-10-04.json.</w:t>
             </w:r>
           </w:p>
         </w:tc>
@@ -5311,7 +5337,7 @@
           <w:rFonts w:ascii="Times New Roman" w:hAnsi="Times New Roman"/>
           <w:sz w:val="24"/>
         </w:rPr>
-        <w:t>[4] Mã nguồn và bằng chứng của dự án: README.md; spark/clean.py; spark/train_model.py; streaming/predict_stream.py; scripts/run_hadoop_streaming.sh; docker-compose.yml; mongodb/init.js; data/results/*.json.</w:t>
+        <w:t>[4] Mã nguồn và bằng chứng của dự án: README.md; spark/clean.py; spark/train_model.py; streaming/predict_stream.py; scripts/run_hadoop_streaming.sh; docker-compose.yml; mongodb/init.js; output/evidence/*.json.</w:t>
       </w:r>
     </w:p>
     <w:p>

</xml_diff>